<commit_message>
Home Base docs + launcher: cover the Anaconda / no-PATH-Python case
Field lesson from the 2026-07-20 rehearsal: the instructor laptop had
Anaconda (invisible to plain PowerShell) and Windows' Store decoy
python.exe answering instead.

- GETTING_STARTED.md / Home_Base_Guide.docx (via make_guide.py) / README:
  Anaconda users should use Anaconda Prompt or the full path, e.g.
  C:\ProgramData\anaconda3\python.exe home_base.py csvs; new
  troubleshooting row decoding the Microsoft Store "Python was not
  found" message.
- run_windows.bat: probe for a *working* python (--version, which the
  Store decoy fails), then py, then standard Anaconda locations
  (machine-wide ProgramData first); say which one it picked.
</commit_message>
<xml_diff>
--- a/classroom_map/Home_Base_Guide.docx
+++ b/classroom_map/Home_Base_Guide.docx
@@ -207,6 +207,19 @@
     </w:p>
     <w:p>
       <w:r>
+        <w:t>Already have Anaconda?</w:t>
+      </w:r>
+    </w:p>
+    <w:p>
+      <w:pPr>
+        <w:pStyle w:val="ListBullet"/>
+      </w:pPr>
+      <w:r>
+        <w:t xml:space="preserve"> Anaconda is Python 3 — skip the install. But it keeps itself out of the normal terminal: open “Anaconda Prompt” from the Start menu and use that window for every command in this guide. (No Anaconda Prompt in the Start menu? Use the full-path row in the troubleshooting table.)</w:t>
+      </w:r>
+    </w:p>
+    <w:p>
+      <w:r>
         <w:t>To confirm it worked, open a terminal (Windows: “Command Prompt”; Mac: “Terminal”) and type:</w:t>
       </w:r>
     </w:p>
@@ -291,7 +304,7 @@
     </w:p>
     <w:p>
       <w:r>
-        <w:t>Double-click the launcher — run_windows.bat (Windows) or run_mac.command (Mac; the first time only, right-click it and choose Open, then Open again in the dialog). With no real CSVs present it automatically uses the bundled fake class and opens the dashboard in your browser. If you see the header, a row of green group chips, and the four tabs, you are ready for lab day.</w:t>
+        <w:t>Double-click the launcher — run_windows.bat (Windows) or run_mac.command (Mac; the first time only, right-click it and choose Open, then Open again in the dialog). With no real CSVs present it automatically uses the bundled fake class and opens the dashboard in your browser. (The Windows launcher finds Python on its own: PATH, then ‘py’, then a standard Anaconda install.) If you see the header, a row of green group chips, and the four tabs, you are ready for lab day.</w:t>
       </w:r>
     </w:p>
     <w:p>
@@ -580,7 +593,29 @@
           </w:tcPr>
           <w:p>
             <w:r>
-              <w:t>Use ‘py’ instead of ‘python’, or reinstall Python and tick ‘Add Python to PATH’.</w:t>
+              <w:t>Use ‘py’ instead of ‘python’, use the Anaconda Prompt if you have Anaconda, or reinstall Python and tick ‘Add Python to PATH’.</w:t>
+            </w:r>
+          </w:p>
+        </w:tc>
+      </w:tr>
+      <w:tr>
+        <w:tc>
+          <w:tcPr>
+            <w:tcW w:type="dxa" w:w="4320"/>
+          </w:tcPr>
+          <w:p>
+            <w:r>
+              <w:t>‘Python was not found; run without arguments to install from the Microsoft Store…’</w:t>
+            </w:r>
+          </w:p>
+        </w:tc>
+        <w:tc>
+          <w:tcPr>
+            <w:tcW w:type="dxa" w:w="4320"/>
+          </w:tcPr>
+          <w:p>
+            <w:r>
+              <w:t>Windows’ decoy python — no real Python is on your PATH. With Anaconda: open “Anaconda Prompt” instead, or run by full path:  C:\ProgramData\anaconda3\python.exe home_base.py csvs  (Anaconda may also live in %LOCALAPPDATA%\anaconda3 or %USERPROFILE%\anaconda3). Without Anaconda: install Python, step 3.1.</w:t>
             </w:r>
           </w:p>
         </w:tc>

</xml_diff>